<commit_message>
Update documentation: all mobile tests pass
Co-Authored-By: Claude Sonnet 5.5 <noreply@anthropic.com>
</commit_message>
<xml_diff>
--- a/docs/project-documentation/Chapter_5_Coding_and_Testing.docx
+++ b/docs/project-documentation/Chapter_5_Coding_and_Testing.docx
@@ -12258,10 +12258,10 @@
           <w:b/>
           <w:bCs/>
         </w:rPr>
-        <w:t xml:space="preserve">8 tests passed and 1 failed.</w:t>
-      </w:r>
-      <w:r>
-        <w:t xml:space="preserve"> The flows that passed are sign-in, login errors, lesson reading, quiz, phishing lab, incident list and report form, and the model test. The one failure is the alerts and account test. The screen shows all the right content, but the test fails because a row on one of those screens is 63 pixels too wide for the small test window (a Flutter layout overflow warning). This is a known issue. It is listed for repair in section 7.6.</w:t>
+        <w:t xml:space="preserve">All 9 tests passed.</w:t>
+      </w:r>
+      <w:r>
+        <w:t xml:space="preserve"> They cover sign-in, login errors, lessons, quiz, phishing lab, incident list and report form, alerts, account sign-out and the model test. An earlier run of the alerts test failed because the alert card footer (type label and time) was 63 pixels too wide for a 400-pixel phone screen. The footer now wraps onto a second line when needed, and the test passes.</w:t>
       </w:r>
     </w:p>
     <w:p>
@@ -13704,7 +13704,7 @@
         <w:spacing w:after="120" w:line="300"/>
       </w:pPr>
       <w:r>
-        <w:t xml:space="preserve">All 348 automatic tests passed, and all 24 live flow checks passed. Together they give strong evidence that the server meets requirements FR1 to FR22. On the mobile app, 18 of 19 tests passed (8 of 9 screen tests and 10 of 10 live tests), and the one failing test shows a layout problem, not a wrong result. The user acceptance script in section 5.6.6 completes the check of the screens on the web and mobile apps.</w:t>
+        <w:t xml:space="preserve">All 348 automatic tests passed, and all 24 live flow checks passed. Together they give strong evidence that the server meets requirements FR1 to FR22. On the mobile app, all 19 tests passed (9 screen tests and 10 live tests). The user acceptance script in section 5.6.6 completes the check of the screens on the web and mobile apps.</w:t>
       </w:r>
     </w:p>
     <w:p>

</xml_diff>